<commit_message>
Linda Bushel: J2 customer drawing set matching the estimate; customer documents stripped of supplier wording
J2 (8 sheets, J1 format): 11 Pro Post piles, Trex Select Island Mist, Vista 42 in railing and 48 in gate,
no skirting, 11 stringers at 12 in, flush lower-deck framing. J1 kept as history.
Master 02 records the stringer quantity gap (about $311) for Ben; Linda's price unchanged.

Co-Authored-By: Claude Opus 5.5 <noreply@anthropic.com>
Claude-Session: https://claude.ai/code/session_01Gt3yQsGEScje26ZopVkG3s
</commit_message>
<xml_diff>
--- a/docs/estimating-cases/2026/linda-bushel-pool-deck/estimates/customer/2026-10-27-linda-bushel-08-customer-detailed-cost-estimate.docx
+++ b/docs/estimating-cases/2026/linda-bushel-pool-deck/estimates/customer/2026-10-27-linda-bushel-08-customer-detailed-cost-estimate.docx
@@ -1844,7 +1844,7 @@
               <w:rPr>
                 <w:sz w:val="16"/>
               </w:rPr>
-              <w:t>Pricing</w:t>
+              <w:t>Validity</w:t>
             </w:r>
           </w:p>
         </w:tc>
@@ -1863,7 +1863,7 @@
               <w:rPr>
                 <w:sz w:val="16"/>
               </w:rPr>
-              <w:t>Material and foundation prices are confirmed with our suppliers when the work is ordered. This estimate is valid for 7 days.</w:t>
+              <w:t>This estimate is valid for 7 days. Prices are confirmed when the work is ordered.</w:t>
             </w:r>
           </w:p>
         </w:tc>

</xml_diff>